<commit_message>
TP3 - Projeto criado, falta criar os testes e fazer os testes das requisições HTTP para todas as rotas
</commit_message>
<xml_diff>
--- a/TP3/documentos/samuel_hermany_DR3_TP3.docx
+++ b/TP3/documentos/samuel_hermany_DR3_TP3.docx
@@ -276,7 +276,7 @@
                                     <w:tag w:val=""/>
                                     <w:id w:val="-650599894"/>
                                     <w:dataBinding w:prefixMappings="xmlns:ns0='http://schemas.microsoft.com/office/2006/coverPageProps' " w:xpath="/ns0:CoverPageProperties[1]/ns0:PublishDate[1]" w:storeItemID="{55AF091B-3C7A-41E3-B477-F2FDAA23CFDA}"/>
-                                    <w:date w:fullDate="2025-05-05T00:00:00Z">
+                                    <w:date w:fullDate="2025-09-08T00:00:00Z">
                                       <w:dateFormat w:val="d/M/yyyy"/>
                                       <w:lid w:val="pt-BR"/>
                                       <w:storeMappedDataAs w:val="dateTime"/>
@@ -301,7 +301,7 @@
                                           <w:sz w:val="28"/>
                                           <w:szCs w:val="28"/>
                                         </w:rPr>
-                                        <w:t>5/5/2025</w:t>
+                                        <w:t>8/9/2025</w:t>
                                       </w:r>
                                     </w:p>
                                   </w:sdtContent>
@@ -3589,7 +3589,7 @@
                               <w:tag w:val=""/>
                               <w:id w:val="-650599894"/>
                               <w:dataBinding w:prefixMappings="xmlns:ns0='http://schemas.microsoft.com/office/2006/coverPageProps' " w:xpath="/ns0:CoverPageProperties[1]/ns0:PublishDate[1]" w:storeItemID="{55AF091B-3C7A-41E3-B477-F2FDAA23CFDA}"/>
-                              <w:date w:fullDate="2025-05-05T00:00:00Z">
+                              <w:date w:fullDate="2025-09-08T00:00:00Z">
                                 <w:dateFormat w:val="d/M/yyyy"/>
                                 <w:lid w:val="pt-BR"/>
                                 <w:storeMappedDataAs w:val="dateTime"/>
@@ -3614,7 +3614,7 @@
                                     <w:sz w:val="28"/>
                                     <w:szCs w:val="28"/>
                                   </w:rPr>
-                                  <w:t>5/5/2025</w:t>
+                                  <w:t>8/9/2025</w:t>
                                 </w:r>
                               </w:p>
                             </w:sdtContent>
@@ -4145,7 +4145,18 @@
                                         <w:sz w:val="28"/>
                                         <w:szCs w:val="28"/>
                                       </w:rPr>
-                                      <w:t>P1</w:t>
+                                      <w:t>P</w:t>
+                                    </w:r>
+                                    <w:r>
+                                      <w:rPr>
+                                        <w:rFonts w:ascii="Arial" w:eastAsiaTheme="majorEastAsia" w:hAnsi="Arial" w:cs="Arial"/>
+                                        <w:b/>
+                                        <w:bCs/>
+                                        <w:color w:val="0070C0"/>
+                                        <w:sz w:val="28"/>
+                                        <w:szCs w:val="28"/>
+                                      </w:rPr>
+                                      <w:t>3</w:t>
                                     </w:r>
                                   </w:sdtContent>
                                 </w:sdt>
@@ -4185,20 +4196,8 @@
                                         <w:szCs w:val="28"/>
                                         <w:lang w:eastAsia="pt-BR"/>
                                       </w:rPr>
-                                      <w:t xml:space="preserve">Desenvolvimento de Serviços com </w:t>
+                                      <w:t>Desenvolvimento de Serviços com SpringBoot</w:t>
                                     </w:r>
-                                    <w:proofErr w:type="spellStart"/>
-                                    <w:r>
-                                      <w:rPr>
-                                        <w:rFonts w:ascii="Arial" w:eastAsia="Times New Roman" w:hAnsi="Arial" w:cs="Arial"/>
-                                        <w:color w:val="0070C0"/>
-                                        <w:sz w:val="28"/>
-                                        <w:szCs w:val="28"/>
-                                        <w:lang w:eastAsia="pt-BR"/>
-                                      </w:rPr>
-                                      <w:t>SpringBoot</w:t>
-                                    </w:r>
-                                    <w:proofErr w:type="spellEnd"/>
                                   </w:sdtContent>
                                 </w:sdt>
                               </w:p>
@@ -4274,7 +4273,18 @@
                                   <w:sz w:val="28"/>
                                   <w:szCs w:val="28"/>
                                 </w:rPr>
-                                <w:t>P1</w:t>
+                                <w:t>P</w:t>
+                              </w:r>
+                              <w:r>
+                                <w:rPr>
+                                  <w:rFonts w:ascii="Arial" w:eastAsiaTheme="majorEastAsia" w:hAnsi="Arial" w:cs="Arial"/>
+                                  <w:b/>
+                                  <w:bCs/>
+                                  <w:color w:val="0070C0"/>
+                                  <w:sz w:val="28"/>
+                                  <w:szCs w:val="28"/>
+                                </w:rPr>
+                                <w:t>3</w:t>
                               </w:r>
                             </w:sdtContent>
                           </w:sdt>
@@ -4314,20 +4324,8 @@
                                   <w:szCs w:val="28"/>
                                   <w:lang w:eastAsia="pt-BR"/>
                                 </w:rPr>
-                                <w:t xml:space="preserve">Desenvolvimento de Serviços com </w:t>
+                                <w:t>Desenvolvimento de Serviços com SpringBoot</w:t>
                               </w:r>
-                              <w:proofErr w:type="spellStart"/>
-                              <w:r>
-                                <w:rPr>
-                                  <w:rFonts w:ascii="Arial" w:eastAsia="Times New Roman" w:hAnsi="Arial" w:cs="Arial"/>
-                                  <w:color w:val="0070C0"/>
-                                  <w:sz w:val="28"/>
-                                  <w:szCs w:val="28"/>
-                                  <w:lang w:eastAsia="pt-BR"/>
-                                </w:rPr>
-                                <w:t>SpringBoot</w:t>
-                              </w:r>
-                              <w:proofErr w:type="spellEnd"/>
                             </w:sdtContent>
                           </w:sdt>
                         </w:p>
@@ -4520,6 +4518,46 @@
       </w:r>
     </w:p>
     <w:p/>
+    <w:p/>
+    <w:p>
+      <w:r>
+        <w:drawing>
+          <wp:inline distT="0" distB="0" distL="0" distR="0" wp14:anchorId="697E9E36" wp14:editId="2A322933">
+            <wp:extent cx="6479540" cy="3099435"/>
+            <wp:effectExtent l="0" t="0" r="0" b="5715"/>
+            <wp:docPr id="33" name="Imagem 33"/>
+            <wp:cNvGraphicFramePr>
+              <a:graphicFrameLocks xmlns:a="http://schemas.openxmlformats.org/drawingml/2006/main" noChangeAspect="1"/>
+            </wp:cNvGraphicFramePr>
+            <a:graphic xmlns:a="http://schemas.openxmlformats.org/drawingml/2006/main">
+              <a:graphicData uri="http://schemas.openxmlformats.org/drawingml/2006/picture">
+                <pic:pic xmlns:pic="http://schemas.openxmlformats.org/drawingml/2006/picture">
+                  <pic:nvPicPr>
+                    <pic:cNvPr id="1" name=""/>
+                    <pic:cNvPicPr/>
+                  </pic:nvPicPr>
+                  <pic:blipFill>
+                    <a:blip r:embed="rId7"/>
+                    <a:stretch>
+                      <a:fillRect/>
+                    </a:stretch>
+                  </pic:blipFill>
+                  <pic:spPr>
+                    <a:xfrm>
+                      <a:off x="0" y="0"/>
+                      <a:ext cx="6479540" cy="3099435"/>
+                    </a:xfrm>
+                    <a:prstGeom prst="rect">
+                      <a:avLst/>
+                    </a:prstGeom>
+                  </pic:spPr>
+                </pic:pic>
+              </a:graphicData>
+            </a:graphic>
+          </wp:inline>
+        </w:drawing>
+      </w:r>
+    </w:p>
     <w:sectPr>
       <w:pgSz w:w="11906" w:h="16838"/>
       <w:pgMar w:top="851" w:right="851" w:bottom="851" w:left="851" w:header="709" w:footer="709" w:gutter="0"/>
@@ -6384,7 +6422,7 @@
 
 <file path=customXml/item1.xml><?xml version="1.0" encoding="utf-8"?>
 <CoverPageProperties xmlns="http://schemas.microsoft.com/office/2006/coverPageProps">
-  <PublishDate>2025-05-05T00:00:00</PublishDate>
+  <PublishDate>2025-09-08T00:00:00</PublishDate>
   <Abstract/>
   <CompanyAddress/>
   <CompanyPhone/>

</xml_diff>